<commit_message>
Agregar analisis del problema y cierre reflexivo a la documentacion
Actividades individuales:
- Paso 1 Analisis del problema: que tarea se repite y por que automatizarla
- Reestructura la Actividad 2 segun los 4 pasos que pide la practica

Documento tecnico:
- Nueva seccion 8: control de versiones y despliegue con Git/GitHub
- Cierre reflexivo: dificultades con Git, ventajas de Linux para despliegue
  y propuestas de mejora de seguridad del sistema
</commit_message>
<xml_diff>
--- a/Documentos de entrega en .docx/Documento_Tecnico_Elvis.docx
+++ b/Documentos de entrega en .docx/Documento_Tecnico_Elvis.docx
@@ -58,7 +58,7 @@
         <w:t xml:space="preserve">Autor: </w:t>
       </w:r>
       <w:r>
-        <w:t>Elvis</w:t>
+        <w:t>Elvis Ragel Toledo Aleman</w:t>
       </w:r>
     </w:p>
     <w:p>
@@ -1425,7 +1425,143 @@
         <w:pStyle w:val="Heading1"/>
       </w:pPr>
       <w:r>
-        <w:t>8. Reflexiones</w:t>
+        <w:t>8. Control de versiones y despliegue (Git / GitHub)</w:t>
+      </w:r>
+    </w:p>
+    <w:p>
+      <w:pPr>
+        <w:pStyle w:val="Heading2"/>
+      </w:pPr>
+      <w:r>
+        <w:t>8.1 Repositorio</w:t>
+      </w:r>
+    </w:p>
+    <w:p>
+      <w:r>
+        <w:t>Todo el codigo, la documentacion y las evidencias del proyecto se versionaron con Git y se publicaron en un repositorio de GitHub:</w:t>
+      </w:r>
+    </w:p>
+    <w:p>
+      <w:r>
+        <w:rPr>
+          <w:rFonts w:ascii="Consolas" w:hAnsi="Consolas"/>
+          <w:sz w:val="18"/>
+        </w:rPr>
+        <w:t>https://github.com/Elvis-Toledo/proyecto-3dsm-g2-servidor</w:t>
+      </w:r>
+    </w:p>
+    <w:p>
+      <w:pPr>
+        <w:pStyle w:val="Heading2"/>
+      </w:pPr>
+      <w:r>
+        <w:t>8.2 Flujo de trabajo aplicado</w:t>
+      </w:r>
+    </w:p>
+    <w:p>
+      <w:r>
+        <w:t>Aunque el proyecto se desarrollo de forma individual, se aplico el flujo de trabajo colaborativo basado en ramas de funcionalidad (feature branches) y Pull Requests, tal como se haria en un equipo. Cada cambio significativo se desarrollo en su propia rama, se abrio un Pull Request describiendo el cambio, y se integro a la rama principal tras su revision.</w:t>
+      </w:r>
+    </w:p>
+    <w:p>
+      <w:r>
+        <w:rPr>
+          <w:rFonts w:ascii="Consolas" w:hAnsi="Consolas"/>
+          <w:sz w:val="18"/>
+        </w:rPr>
+        <w:t># Crear rama de funcionalidad</w:t>
+        <w:br/>
+        <w:t>git checkout -b feature/nombre-funcionalidad</w:t>
+        <w:br/>
+        <w:br/>
+        <w:t># Trabajar y confirmar cambios</w:t>
+        <w:br/>
+        <w:t>git add .</w:t>
+        <w:br/>
+        <w:t>git commit -m "Descripcion del cambio"</w:t>
+        <w:br/>
+        <w:br/>
+        <w:t># Publicar la rama</w:t>
+        <w:br/>
+        <w:t>git push origin feature/nombre-funcionalidad</w:t>
+        <w:br/>
+        <w:br/>
+        <w:t># Integrar mediante Pull Request en GitHub</w:t>
+        <w:br/>
+        <w:t># y luego actualizar la rama local</w:t>
+        <w:br/>
+        <w:t>git checkout main</w:t>
+        <w:br/>
+        <w:t>git pull origin main</w:t>
+      </w:r>
+    </w:p>
+    <w:p>
+      <w:pPr>
+        <w:pStyle w:val="Heading2"/>
+      </w:pPr>
+      <w:r>
+        <w:t>8.3 Despliegue en el servidor</w:t>
+      </w:r>
+    </w:p>
+    <w:p>
+      <w:r>
+        <w:t>La aplicacion se desplego clonando el repositorio directamente en el servidor, en lugar de copiar los archivos manualmente. Esto garantiza que el codigo en produccion sea exactamente el mismo que esta versionado, y permite actualizarlo con un simple git pull.</w:t>
+      </w:r>
+    </w:p>
+    <w:p>
+      <w:r>
+        <w:rPr>
+          <w:rFonts w:ascii="Consolas" w:hAnsi="Consolas"/>
+          <w:sz w:val="18"/>
+        </w:rPr>
+        <w:t>cd /var/www/html</w:t>
+        <w:br/>
+        <w:t>git clone https://github.com/Elvis-Toledo/proyecto-3dsm-g2-servidor.git repo</w:t>
+        <w:br/>
+        <w:t>cp repo/web/*.php repo/web/*.html /var/www/html/</w:t>
+        <w:br/>
+        <w:t>chown -R apache:apache /var/www/html</w:t>
+        <w:br/>
+        <w:t>restorecon -Rv /var/www/html    # restaurar contexto SELinux</w:t>
+        <w:br/>
+        <w:t>systemctl restart httpd</w:t>
+      </w:r>
+    </w:p>
+    <w:p>
+      <w:pPr>
+        <w:pStyle w:val="Heading2"/>
+      </w:pPr>
+      <w:r>
+        <w:t>8.4 Manejo de credenciales</w:t>
+      </w:r>
+    </w:p>
+    <w:p>
+      <w:r>
+        <w:t>Para no exponer la contrasena de la base de datos en un repositorio publico, la aplicacion la lee de la variable de entorno DB_PASS mediante getenv(). La variable se define en la configuracion de Apache, fuera del control de versiones:</w:t>
+      </w:r>
+    </w:p>
+    <w:p>
+      <w:r>
+        <w:rPr>
+          <w:rFonts w:ascii="Consolas" w:hAnsi="Consolas"/>
+          <w:sz w:val="18"/>
+        </w:rPr>
+        <w:t># /etc/httpd/conf.d/app.conf</w:t>
+        <w:br/>
+        <w:t>SetEnv DB_PASS "admin123"</w:t>
+        <w:br/>
+        <w:br/>
+        <w:t># Aplicar el cambio</w:t>
+        <w:br/>
+        <w:t>systemctl restart httpd</w:t>
+      </w:r>
+    </w:p>
+    <w:p>
+      <w:pPr>
+        <w:pStyle w:val="Heading1"/>
+      </w:pPr>
+      <w:r>
+        <w:t>9. Reflexiones</w:t>
       </w:r>
     </w:p>
     <w:p>
@@ -1508,10 +1644,72 @@
     </w:p>
     <w:p>
       <w:pPr>
+        <w:pStyle w:val="Heading2"/>
+      </w:pPr>
+      <w:r>
+        <w:t>9.1 Cierre reflexivo del proyecto</w:t>
+      </w:r>
+    </w:p>
+    <w:p>
+      <w:r>
+        <w:rPr>
+          <w:b/>
+        </w:rPr>
+        <w:t xml:space="preserve">Que dificultades hubo al trabajar con Git? </w:t>
+      </w:r>
+    </w:p>
+    <w:p>
+      <w:r>
+        <w:t>La principal dificultad fue de autenticacion: el gestor de credenciales de Windows tenia guardada una cuenta de GitHub distinta a la propietaria del repositorio, lo que provocaba un error 403 al intentar hacer push. Se resolvio eliminando la credencial almacenada para forzar una nueva autenticacion. Otra consideracion fue evitar subir la contrasena de la base de datos al repositorio publico, lo que llevo a refactorizar el codigo para leerla desde una variable de entorno. En un trabajo en equipo, las dificultades tipicas serian los conflictos de fusion cuando dos integrantes modifican el mismo archivo, la necesidad de mantener las ramas sincronizadas con main, y acordar convenciones de nombres de ramas y mensajes de commit.</w:t>
+      </w:r>
+    </w:p>
+    <w:p>
+      <w:r>
+        <w:rPr>
+          <w:b/>
+        </w:rPr>
+        <w:t xml:space="preserve">Que ventajas ofrece Linux para el despliegue? </w:t>
+      </w:r>
+    </w:p>
+    <w:p>
+      <w:r>
+        <w:t>Linux ofrece control total sobre los servicios mediante systemd, un gestor de paquetes que resuelve dependencias automaticamente (dnf), consumo de recursos mucho menor al no requerir interfaz grafica en produccion, y estabilidad para procesos de larga duracion. Ademas, casi todo el ecosistema de servidores (Apache, Nginx, MariaDB, BIND, Docker) es nativo de Linux, la administracion remota por SSH es ligera y segura, y todo el despliegue puede automatizarse mediante scripts. El hecho de que la configuracion viva en archivos de texto plano bajo /etc facilita versionarla y replicarla en otros servidores.</w:t>
+      </w:r>
+    </w:p>
+    <w:p>
+      <w:r>
+        <w:rPr>
+          <w:b/>
+        </w:rPr>
+        <w:t xml:space="preserve">Como mejorarias la seguridad del sistema? </w:t>
+      </w:r>
+    </w:p>
+    <w:p>
+      <w:r>
+        <w:t>En el servidor: deshabilitar el inicio de sesion de root por SSH (PermitRootLogin no), sustituir la autenticacion por contrasena con llaves publicas, instalar fail2ban para bloquear intentos de fuerza bruta, y mantener SELinux en modo enforcing.</w:t>
+      </w:r>
+    </w:p>
+    <w:p>
+      <w:r>
+        <w:t>En la base de datos: crear un usuario especifico para la aplicacion con permisos limitados unicamente a SELECT e INSERT sobre app_db, en lugar de conectarse como root; y usar una contrasena fuerte generada aleatoriamente.</w:t>
+      </w:r>
+    </w:p>
+    <w:p>
+      <w:r>
+        <w:t>En la aplicacion: implementar HTTPS con un certificado TLS, validar y sanear toda entrada del usuario, usar sentencias preparadas para prevenir inyeccion SQL (ya implementado en index.php), agregar proteccion CSRF en los formularios y un sistema de autenticacion para restringir el alta de usuarios.</w:t>
+      </w:r>
+    </w:p>
+    <w:p>
+      <w:r>
+        <w:t>A nivel de red: segmentar los servicios en VLANs, restringir el acceso a MariaDB unicamente desde localhost, y establecer un esquema de respaldos automatizados con verificacion periodica de su restauracion.</w:t>
+      </w:r>
+    </w:p>
+    <w:p>
+      <w:pPr>
         <w:pStyle w:val="Heading1"/>
       </w:pPr>
       <w:r>
-        <w:t>9. Conclusiones</w:t>
+        <w:t>10. Conclusiones</w:t>
       </w:r>
     </w:p>
     <w:p>
@@ -1534,7 +1732,7 @@
         <w:pStyle w:val="Heading1"/>
       </w:pPr>
       <w:r>
-        <w:t>10. Anexos</w:t>
+        <w:t>11. Anexos</w:t>
       </w:r>
     </w:p>
     <w:p>
@@ -1542,7 +1740,7 @@
         <w:pStyle w:val="Heading2"/>
       </w:pPr>
       <w:r>
-        <w:t>10.1 Comandos de instalacion completos</w:t>
+        <w:t>11.1 Comandos de instalacion completos</w:t>
       </w:r>
     </w:p>
     <w:p>
@@ -1597,7 +1795,7 @@
         <w:pStyle w:val="Heading2"/>
       </w:pPr>
       <w:r>
-        <w:t>10.2 Instalacion de paquetes (evidencia)</w:t>
+        <w:t>11.2 Instalacion de paquetes (evidencia)</w:t>
       </w:r>
     </w:p>
     <w:p>
@@ -1650,6 +1848,51 @@
           <w:sz w:val="18"/>
         </w:rPr>
         <w:t>Figura 18. Salida final de dnf install con todos los paquetes instalados.</w:t>
+      </w:r>
+    </w:p>
+    <w:p>
+      <w:pPr>
+        <w:pStyle w:val="Heading2"/>
+      </w:pPr>
+      <w:r>
+        <w:t>11.3 Contenido del repositorio</w:t>
+      </w:r>
+    </w:p>
+    <w:p>
+      <w:r>
+        <w:rPr>
+          <w:rFonts w:ascii="Consolas" w:hAnsi="Consolas"/>
+          <w:sz w:val="18"/>
+        </w:rPr>
+        <w:t>proyecto-3dsm-g2-servidor/</w:t>
+        <w:br/>
+        <w:t xml:space="preserve">    README.md                       Documentacion del repositorio</w:t>
+        <w:br/>
+        <w:t xml:space="preserve">    .gitignore                      Exclusiones de control de versiones</w:t>
+        <w:br/>
+        <w:t xml:space="preserve">    Capturas/                       35 evidencias graficas del proyecto</w:t>
+        <w:br/>
+        <w:t xml:space="preserve">    Documentos de entrega en .docx/</w:t>
+        <w:br/>
+        <w:t xml:space="preserve">        FASE1_Planeacion_Elvis.docx</w:t>
+        <w:br/>
+        <w:t xml:space="preserve">        Actividades_Individuales_Elvis.docx</w:t>
+        <w:br/>
+        <w:t xml:space="preserve">        Documento_Tecnico_Elvis.docx</w:t>
+        <w:br/>
+        <w:t xml:space="preserve">    Documentos de entrega en PDF/   Version PDF de los documentos</w:t>
+        <w:br/>
+        <w:t xml:space="preserve">    scripts/</w:t>
+        <w:br/>
+        <w:t xml:space="preserve">        limpieza.sh                 Script de automatizacion con cron</w:t>
+        <w:br/>
+        <w:t xml:space="preserve">    web/</w:t>
+        <w:br/>
+        <w:t xml:space="preserve">        index.php                   Aplicacion principal (alta + listado)</w:t>
+        <w:br/>
+        <w:t xml:space="preserve">        index.html                  Pagina informativa del servidor</w:t>
+        <w:br/>
+        <w:t xml:space="preserve">        usuarios.php                Vista de solo lectura del listado</w:t>
       </w:r>
     </w:p>
     <w:sectPr>

</xml_diff>

<commit_message>
FASE 7: agregar evidencias del despliegue y del alta de usuarios
Capturas nuevas:
- Alta de usuario exitosa desde el cliente Fedora (RF-01 validado)
- Clonado del repositorio en el servidor y reetiquetado SELinux
- Diagnostico y ajuste de la directiva DirectoryIndex

Documento tecnico:
- Seccion 7.7 con la validacion del requerimiento de alta de usuarios
- Seccion 8.3 documenta el despliegue real y el retiro del clon del
  directorio publicado por Apache
- Seccion 8.4 corrige el manejo de DB_PASS para PHP-FPM

Se regeneraron los tres documentos en PDF.
</commit_message>
<xml_diff>
--- a/Documentos de entrega en .docx/Documento_Tecnico_Elvis.docx
+++ b/Documentos de entrega en .docx/Documento_Tecnico_Elvis.docx
@@ -1360,7 +1360,7 @@
         <w:pStyle w:val="Heading2"/>
       </w:pPr>
       <w:r>
-        <w:t>7.6 PHP + MariaDB</w:t>
+        <w:t>7.6 PHP + MariaDB (consulta de datos)</w:t>
       </w:r>
     </w:p>
     <w:p>
@@ -1418,6 +1418,76 @@
           <w:sz w:val="18"/>
         </w:rPr>
         <w:t>Figura 17. Tabla de usuarios servida por PHP con datos de MariaDB.</w:t>
+      </w:r>
+    </w:p>
+    <w:p>
+      <w:pPr>
+        <w:pStyle w:val="Heading2"/>
+      </w:pPr>
+      <w:r>
+        <w:t>7.7 Alta de usuarios (RF-01)</w:t>
+      </w:r>
+    </w:p>
+    <w:p>
+      <w:r>
+        <w:t>Se valido el requerimiento funcional RF-01 registrando un usuario nuevo desde el formulario de la aplicacion en el cliente Fedora. El sistema confirmo la operacion con el mensaje "Usuario registrado correctamente" y el registro aparecio de inmediato en el listado con el identificador 4, generado automaticamente por la columna AUTO_INCREMENT de la tabla.</w:t>
+      </w:r>
+    </w:p>
+    <w:p>
+      <w:r>
+        <w:t>La insercion se realiza con una sentencia preparada (prepared statement), lo que previene ataques de inyeccion SQL, y la salida se escapa con htmlspecialchars() para prevenir XSS. En la captura, el correo del cuarto registro se oculto deliberadamente por tratarse de una direccion personal real.</w:t>
+      </w:r>
+    </w:p>
+    <w:p>
+      <w:pPr>
+        <w:jc w:val="center"/>
+      </w:pPr>
+      <w:r>
+        <w:drawing>
+          <wp:inline xmlns:a="http://schemas.openxmlformats.org/drawingml/2006/main" xmlns:pic="http://schemas.openxmlformats.org/drawingml/2006/picture">
+            <wp:extent cx="4206240" cy="4662256"/>
+            <wp:docPr id="18" name="Picture 18"/>
+            <wp:cNvGraphicFramePr>
+              <a:graphicFrameLocks noChangeAspect="1"/>
+            </wp:cNvGraphicFramePr>
+            <a:graphic>
+              <a:graphicData uri="http://schemas.openxmlformats.org/drawingml/2006/picture">
+                <pic:pic>
+                  <pic:nvPicPr>
+                    <pic:cNvPr id="0" name="05_09_cliente_alta_usuario_ok.png"/>
+                    <pic:cNvPicPr/>
+                  </pic:nvPicPr>
+                  <pic:blipFill>
+                    <a:blip r:embed="rId26"/>
+                    <a:stretch>
+                      <a:fillRect/>
+                    </a:stretch>
+                  </pic:blipFill>
+                  <pic:spPr>
+                    <a:xfrm>
+                      <a:off x="0" y="0"/>
+                      <a:ext cx="4206240" cy="4662256"/>
+                    </a:xfrm>
+                    <a:prstGeom prst="rect"/>
+                  </pic:spPr>
+                </pic:pic>
+              </a:graphicData>
+            </a:graphic>
+          </wp:inline>
+        </w:drawing>
+      </w:r>
+    </w:p>
+    <w:p>
+      <w:pPr>
+        <w:jc w:val="center"/>
+      </w:pPr>
+      <w:r>
+        <w:rPr>
+          <w:i/>
+          <w:color w:val="555555"/>
+          <w:sz w:val="18"/>
+        </w:rPr>
+        <w:t>Figura 18. Alta de usuario exitosa desde el cliente: confirmacion del registro y listado actualizado con el nuevo usuario (ID 4).</w:t>
       </w:r>
     </w:p>
     <w:p>
@@ -1518,13 +1588,146 @@
         <w:br/>
         <w:t>git clone https://github.com/Elvis-Toledo/proyecto-3dsm-g2-servidor.git repo</w:t>
         <w:br/>
-        <w:t>cp repo/web/*.php repo/web/*.html /var/www/html/</w:t>
+        <w:t>cp repo/web/index.php repo/web/index.html repo/web/usuarios.php /var/www/html/</w:t>
         <w:br/>
         <w:t>chown -R apache:apache /var/www/html</w:t>
         <w:br/>
-        <w:t>restorecon -Rv /var/www/html    # restaurar contexto SELinux</w:t>
+        <w:t>restorecon -Rv /var/www/html    # restaurar el contexto SELinux</w:t>
         <w:br/>
-        <w:t>systemctl restart httpd</w:t>
+        <w:t>systemctl restart php-fpm httpd</w:t>
+      </w:r>
+    </w:p>
+    <w:p>
+      <w:pPr>
+        <w:jc w:val="center"/>
+      </w:pPr>
+      <w:r>
+        <w:drawing>
+          <wp:inline xmlns:a="http://schemas.openxmlformats.org/drawingml/2006/main" xmlns:pic="http://schemas.openxmlformats.org/drawingml/2006/picture">
+            <wp:extent cx="5486400" cy="2510053"/>
+            <wp:docPr id="19" name="Picture 19"/>
+            <wp:cNvGraphicFramePr>
+              <a:graphicFrameLocks noChangeAspect="1"/>
+            </wp:cNvGraphicFramePr>
+            <a:graphic>
+              <a:graphicData uri="http://schemas.openxmlformats.org/drawingml/2006/picture">
+                <pic:pic>
+                  <pic:nvPicPr>
+                    <pic:cNvPr id="0" name="06_01_despliegue_git_clone.png"/>
+                    <pic:cNvPicPr/>
+                  </pic:nvPicPr>
+                  <pic:blipFill>
+                    <a:blip r:embed="rId27"/>
+                    <a:stretch>
+                      <a:fillRect/>
+                    </a:stretch>
+                  </pic:blipFill>
+                  <pic:spPr>
+                    <a:xfrm>
+                      <a:off x="0" y="0"/>
+                      <a:ext cx="5486400" cy="2510053"/>
+                    </a:xfrm>
+                    <a:prstGeom prst="rect"/>
+                  </pic:spPr>
+                </pic:pic>
+              </a:graphicData>
+            </a:graphic>
+          </wp:inline>
+        </w:drawing>
+      </w:r>
+    </w:p>
+    <w:p>
+      <w:pPr>
+        <w:jc w:val="center"/>
+      </w:pPr>
+      <w:r>
+        <w:rPr>
+          <w:i/>
+          <w:color w:val="555555"/>
+          <w:sz w:val="18"/>
+        </w:rPr>
+        <w:t>Figura 19. Clonado del repositorio en el servidor y reetiquetado SELinux.</w:t>
+      </w:r>
+    </w:p>
+    <w:p>
+      <w:r>
+        <w:t>Posteriormente el clon se movio fuera del directorio publicado por Apache (/opt/proyecto-3dsm) para que el contenido del repositorio, incluido el directorio .git, no quedara accesible desde el navegador. Exponer .git en un servidor web permitiria a un atacante reconstruir todo el codigo fuente del proyecto.</w:t>
+      </w:r>
+    </w:p>
+    <w:p>
+      <w:r>
+        <w:rPr>
+          <w:rFonts w:ascii="Consolas" w:hAnsi="Consolas"/>
+          <w:sz w:val="18"/>
+        </w:rPr>
+        <w:t>rm -rf /var/www/html/repo</w:t>
+        <w:br/>
+        <w:t>git clone https://github.com/Elvis-Toledo/proyecto-3dsm-g2-servidor.git /opt/proyecto-3dsm</w:t>
+      </w:r>
+    </w:p>
+    <w:p>
+      <w:pPr>
+        <w:pStyle w:val="Heading2"/>
+      </w:pPr>
+      <w:r>
+        <w:t>8.3.1 Ajuste de la pagina por defecto</w:t>
+      </w:r>
+    </w:p>
+    <w:p>
+      <w:r>
+        <w:t>Durante el despliegue se detecto que Apache seguia sirviendo index.html en lugar de index.php. La causa fue la coexistencia de varias directivas DirectoryIndex en distintos archivos de configuracion (httpd.conf, conf.d/php.conf y los archivos creados durante la practica). Se resolvio renombrando la pagina informativa a servidor.html, de modo que index.php quedara como unico indice del directorio.</w:t>
+      </w:r>
+    </w:p>
+    <w:p>
+      <w:pPr>
+        <w:jc w:val="center"/>
+      </w:pPr>
+      <w:r>
+        <w:drawing>
+          <wp:inline xmlns:a="http://schemas.openxmlformats.org/drawingml/2006/main" xmlns:pic="http://schemas.openxmlformats.org/drawingml/2006/picture">
+            <wp:extent cx="5486400" cy="1713262"/>
+            <wp:docPr id="20" name="Picture 20"/>
+            <wp:cNvGraphicFramePr>
+              <a:graphicFrameLocks noChangeAspect="1"/>
+            </wp:cNvGraphicFramePr>
+            <a:graphic>
+              <a:graphicData uri="http://schemas.openxmlformats.org/drawingml/2006/picture">
+                <pic:pic>
+                  <pic:nvPicPr>
+                    <pic:cNvPr id="0" name="06_02_directoryindex_ajuste.png"/>
+                    <pic:cNvPicPr/>
+                  </pic:nvPicPr>
+                  <pic:blipFill>
+                    <a:blip r:embed="rId28"/>
+                    <a:stretch>
+                      <a:fillRect/>
+                    </a:stretch>
+                  </pic:blipFill>
+                  <pic:spPr>
+                    <a:xfrm>
+                      <a:off x="0" y="0"/>
+                      <a:ext cx="5486400" cy="1713262"/>
+                    </a:xfrm>
+                    <a:prstGeom prst="rect"/>
+                  </pic:spPr>
+                </pic:pic>
+              </a:graphicData>
+            </a:graphic>
+          </wp:inline>
+        </w:drawing>
+      </w:r>
+    </w:p>
+    <w:p>
+      <w:pPr>
+        <w:jc w:val="center"/>
+      </w:pPr>
+      <w:r>
+        <w:rPr>
+          <w:i/>
+          <w:color w:val="555555"/>
+          <w:sz w:val="18"/>
+        </w:rPr>
+        <w:t>Figura 20. Diagnostico de las directivas DirectoryIndex y ajuste aplicado.</w:t>
       </w:r>
     </w:p>
     <w:p>
@@ -1537,7 +1740,7 @@
     </w:p>
     <w:p>
       <w:r>
-        <w:t>Para no exponer la contrasena de la base de datos en un repositorio publico, la aplicacion la lee de la variable de entorno DB_PASS mediante getenv(). La variable se define en la configuracion de Apache, fuera del control de versiones:</w:t>
+        <w:t>Para no exponer la contrasena de la base de datos en un repositorio publico, la aplicacion la lee de la variable de entorno DB_PASS. La variable se define en el pool de PHP-FPM, un archivo que no forma parte del control de versiones:</w:t>
       </w:r>
     </w:p>
     <w:p>
@@ -1546,14 +1749,19 @@
           <w:rFonts w:ascii="Consolas" w:hAnsi="Consolas"/>
           <w:sz w:val="18"/>
         </w:rPr>
-        <w:t># /etc/httpd/conf.d/app.conf</w:t>
+        <w:t># /etc/php-fpm.d/www.conf</w:t>
         <w:br/>
-        <w:t>SetEnv DB_PASS "admin123"</w:t>
+        <w:t>env[DB_PASS] = &lt;contrasena_de_la_base_de_datos&gt;</w:t>
         <w:br/>
         <w:br/>
         <w:t># Aplicar el cambio</w:t>
         <w:br/>
-        <w:t>systemctl restart httpd</w:t>
+        <w:t>systemctl restart php-fpm httpd</w:t>
+      </w:r>
+    </w:p>
+    <w:p>
+      <w:r>
+        <w:t>Se opto por definirla en PHP-FPM y no con SetEnv en Apache porque, al ejecutarse PHP como un proceso independiente (FastCGI), las variables declaradas con SetEnv llegan como parametros de la peticion en $_SERVER y no siempre estan disponibles a traves de getenv(). El codigo de la aplicacion consulta ambas fuentes para ser compatible con los dos escenarios.</w:t>
       </w:r>
     </w:p>
     <w:p>
@@ -1806,7 +2014,7 @@
         <w:drawing>
           <wp:inline xmlns:a="http://schemas.openxmlformats.org/drawingml/2006/main" xmlns:pic="http://schemas.openxmlformats.org/drawingml/2006/picture">
             <wp:extent cx="5486400" cy="2639432"/>
-            <wp:docPr id="18" name="Picture 18"/>
+            <wp:docPr id="21" name="Picture 21"/>
             <wp:cNvGraphicFramePr>
               <a:graphicFrameLocks noChangeAspect="1"/>
             </wp:cNvGraphicFramePr>
@@ -1818,7 +2026,7 @@
                     <pic:cNvPicPr/>
                   </pic:nvPicPr>
                   <pic:blipFill>
-                    <a:blip r:embed="rId26"/>
+                    <a:blip r:embed="rId29"/>
                     <a:stretch>
                       <a:fillRect/>
                     </a:stretch>
@@ -1847,7 +2055,7 @@
           <w:color w:val="555555"/>
           <w:sz w:val="18"/>
         </w:rPr>
-        <w:t>Figura 18. Salida final de dnf install con todos los paquetes instalados.</w:t>
+        <w:t>Figura 21. Salida final de dnf install con todos los paquetes instalados.</w:t>
       </w:r>
     </w:p>
     <w:p>

</xml_diff>

<commit_message>
Agregar evidencias del control de versiones en GitHub
Capturas del historial de commits con los merges de cada Pull Request,
del listado de Pull Requests fusionados y de la pagina principal del
repositorio con el README renderizado.

Documento tecnico: nueva seccion 8.5 con estas evidencias.
Se regeneraron los tres documentos en PDF.
</commit_message>
<xml_diff>
--- a/Documentos de entrega en .docx/Documento_Tecnico_Elvis.docx
+++ b/Documentos de entrega en .docx/Documento_Tecnico_Elvis.docx
@@ -1766,6 +1766,185 @@
     </w:p>
     <w:p>
       <w:pPr>
+        <w:pStyle w:val="Heading2"/>
+      </w:pPr>
+      <w:r>
+        <w:t>8.5 Evidencias del control de versiones</w:t>
+      </w:r>
+    </w:p>
+    <w:p>
+      <w:r>
+        <w:t>El historial de commits refleja el flujo de trabajo aplicado: cada funcionalidad se desarrollo en su propia rama y se integro a main mediante un commit de fusion generado por el Pull Request correspondiente. Los commits de fusion aparecen identificados como "Merge pull request #N from ..." y verificados por GitHub.</w:t>
+      </w:r>
+    </w:p>
+    <w:p>
+      <w:pPr>
+        <w:jc w:val="center"/>
+      </w:pPr>
+      <w:r>
+        <w:drawing>
+          <wp:inline xmlns:a="http://schemas.openxmlformats.org/drawingml/2006/main" xmlns:pic="http://schemas.openxmlformats.org/drawingml/2006/picture">
+            <wp:extent cx="5486400" cy="1864061"/>
+            <wp:docPr id="21" name="Picture 21"/>
+            <wp:cNvGraphicFramePr>
+              <a:graphicFrameLocks noChangeAspect="1"/>
+            </wp:cNvGraphicFramePr>
+            <a:graphic>
+              <a:graphicData uri="http://schemas.openxmlformats.org/drawingml/2006/picture">
+                <pic:pic>
+                  <pic:nvPicPr>
+                    <pic:cNvPr id="0" name="06_03_github_historial_commits.png"/>
+                    <pic:cNvPicPr/>
+                  </pic:nvPicPr>
+                  <pic:blipFill>
+                    <a:blip r:embed="rId29"/>
+                    <a:stretch>
+                      <a:fillRect/>
+                    </a:stretch>
+                  </pic:blipFill>
+                  <pic:spPr>
+                    <a:xfrm>
+                      <a:off x="0" y="0"/>
+                      <a:ext cx="5486400" cy="1864061"/>
+                    </a:xfrm>
+                    <a:prstGeom prst="rect"/>
+                  </pic:spPr>
+                </pic:pic>
+              </a:graphicData>
+            </a:graphic>
+          </wp:inline>
+        </w:drawing>
+      </w:r>
+    </w:p>
+    <w:p>
+      <w:pPr>
+        <w:jc w:val="center"/>
+      </w:pPr>
+      <w:r>
+        <w:rPr>
+          <w:i/>
+          <w:color w:val="555555"/>
+          <w:sz w:val="18"/>
+        </w:rPr>
+        <w:t>Figura 21. Historial de commits en la rama main, con los commits de fusion de cada Pull Request.</w:t>
+      </w:r>
+    </w:p>
+    <w:p>
+      <w:r>
+        <w:t>La seccion de Pull Requests conserva el registro de cada integracion, con su titulo descriptivo, la rama de origen y su estado. Todos fueron revisados y fusionados sin conflictos.</w:t>
+      </w:r>
+    </w:p>
+    <w:p>
+      <w:pPr>
+        <w:jc w:val="center"/>
+      </w:pPr>
+      <w:r>
+        <w:drawing>
+          <wp:inline xmlns:a="http://schemas.openxmlformats.org/drawingml/2006/main" xmlns:pic="http://schemas.openxmlformats.org/drawingml/2006/picture">
+            <wp:extent cx="5486400" cy="3401834"/>
+            <wp:docPr id="22" name="Picture 22"/>
+            <wp:cNvGraphicFramePr>
+              <a:graphicFrameLocks noChangeAspect="1"/>
+            </wp:cNvGraphicFramePr>
+            <a:graphic>
+              <a:graphicData uri="http://schemas.openxmlformats.org/drawingml/2006/picture">
+                <pic:pic>
+                  <pic:nvPicPr>
+                    <pic:cNvPr id="0" name="06_04_github_pull_requests.png"/>
+                    <pic:cNvPicPr/>
+                  </pic:nvPicPr>
+                  <pic:blipFill>
+                    <a:blip r:embed="rId30"/>
+                    <a:stretch>
+                      <a:fillRect/>
+                    </a:stretch>
+                  </pic:blipFill>
+                  <pic:spPr>
+                    <a:xfrm>
+                      <a:off x="0" y="0"/>
+                      <a:ext cx="5486400" cy="3401834"/>
+                    </a:xfrm>
+                    <a:prstGeom prst="rect"/>
+                  </pic:spPr>
+                </pic:pic>
+              </a:graphicData>
+            </a:graphic>
+          </wp:inline>
+        </w:drawing>
+      </w:r>
+    </w:p>
+    <w:p>
+      <w:pPr>
+        <w:jc w:val="center"/>
+      </w:pPr>
+      <w:r>
+        <w:rPr>
+          <w:i/>
+          <w:color w:val="555555"/>
+          <w:sz w:val="18"/>
+        </w:rPr>
+        <w:t>Figura 22. Historial de Pull Requests fusionados en el repositorio.</w:t>
+      </w:r>
+    </w:p>
+    <w:p>
+      <w:r>
+        <w:t>La pagina principal del repositorio muestra la estructura de carpetas del proyecto, el numero de ramas y commits, y el README renderizado con la documentacion tecnica de la solucion.</w:t>
+      </w:r>
+    </w:p>
+    <w:p>
+      <w:pPr>
+        <w:jc w:val="center"/>
+      </w:pPr>
+      <w:r>
+        <w:drawing>
+          <wp:inline xmlns:a="http://schemas.openxmlformats.org/drawingml/2006/main" xmlns:pic="http://schemas.openxmlformats.org/drawingml/2006/picture">
+            <wp:extent cx="5486400" cy="2604394"/>
+            <wp:docPr id="23" name="Picture 23"/>
+            <wp:cNvGraphicFramePr>
+              <a:graphicFrameLocks noChangeAspect="1"/>
+            </wp:cNvGraphicFramePr>
+            <a:graphic>
+              <a:graphicData uri="http://schemas.openxmlformats.org/drawingml/2006/picture">
+                <pic:pic>
+                  <pic:nvPicPr>
+                    <pic:cNvPr id="0" name="06_05_github_repositorio.png"/>
+                    <pic:cNvPicPr/>
+                  </pic:nvPicPr>
+                  <pic:blipFill>
+                    <a:blip r:embed="rId31"/>
+                    <a:stretch>
+                      <a:fillRect/>
+                    </a:stretch>
+                  </pic:blipFill>
+                  <pic:spPr>
+                    <a:xfrm>
+                      <a:off x="0" y="0"/>
+                      <a:ext cx="5486400" cy="2604394"/>
+                    </a:xfrm>
+                    <a:prstGeom prst="rect"/>
+                  </pic:spPr>
+                </pic:pic>
+              </a:graphicData>
+            </a:graphic>
+          </wp:inline>
+        </w:drawing>
+      </w:r>
+    </w:p>
+    <w:p>
+      <w:pPr>
+        <w:jc w:val="center"/>
+      </w:pPr>
+      <w:r>
+        <w:rPr>
+          <w:i/>
+          <w:color w:val="555555"/>
+          <w:sz w:val="18"/>
+        </w:rPr>
+        <w:t>Figura 23. Pagina principal del repositorio publico en GitHub.</w:t>
+      </w:r>
+    </w:p>
+    <w:p>
+      <w:pPr>
         <w:pStyle w:val="Heading1"/>
       </w:pPr>
       <w:r>
@@ -2014,7 +2193,7 @@
         <w:drawing>
           <wp:inline xmlns:a="http://schemas.openxmlformats.org/drawingml/2006/main" xmlns:pic="http://schemas.openxmlformats.org/drawingml/2006/picture">
             <wp:extent cx="5486400" cy="2639432"/>
-            <wp:docPr id="21" name="Picture 21"/>
+            <wp:docPr id="24" name="Picture 24"/>
             <wp:cNvGraphicFramePr>
               <a:graphicFrameLocks noChangeAspect="1"/>
             </wp:cNvGraphicFramePr>
@@ -2026,7 +2205,7 @@
                     <pic:cNvPicPr/>
                   </pic:nvPicPr>
                   <pic:blipFill>
-                    <a:blip r:embed="rId29"/>
+                    <a:blip r:embed="rId32"/>
                     <a:stretch>
                       <a:fillRect/>
                     </a:stretch>
@@ -2055,7 +2234,7 @@
           <w:color w:val="555555"/>
           <w:sz w:val="18"/>
         </w:rPr>
-        <w:t>Figura 21. Salida final de dnf install con todos los paquetes instalados.</w:t>
+        <w:t>Figura 24. Salida final de dnf install con todos los paquetes instalados.</w:t>
       </w:r>
     </w:p>
     <w:p>

</xml_diff>

<commit_message>
Agregar a Julio Cesar Lugo Rodriguez como integrante del equipo
Documento de planeacion:
- Portada con ambos integrantes
- Seccion 5 reescrita como organizacion de equipo, con el responsable
  de cada rol: liderazgo, DevOps y backend a cargo de Elvis Ragel Toledo
  Aleman; frontend y documentacion a cargo de Julio Cesar Lugo Rodriguez

Documento tecnico:
- Portada con ambos integrantes
- Seccion 8.2 redactada en terminos de trabajo en equipo

README y encabezados de codigo: ambos autores.

Las actividades individuales quedan a nombre de un solo estudiante por
tratarse de una practica de modalidad individual segun la consigna.
</commit_message>
<xml_diff>
--- a/Documentos de entrega en .docx/Documento_Tecnico_Elvis.docx
+++ b/Documentos de entrega en .docx/Documento_Tecnico_Elvis.docx
@@ -55,10 +55,15 @@
         <w:rPr>
           <w:b/>
         </w:rPr>
-        <w:t xml:space="preserve">Autor: </w:t>
+        <w:t xml:space="preserve">Integrantes: </w:t>
       </w:r>
       <w:r>
         <w:t>Elvis Ragel Toledo Aleman</w:t>
+      </w:r>
+    </w:p>
+    <w:p>
+      <w:r>
+        <w:t xml:space="preserve">                            Julio Cesar Lugo Rodriguez</w:t>
       </w:r>
     </w:p>
     <w:p>
@@ -1530,7 +1535,7 @@
     </w:p>
     <w:p>
       <w:r>
-        <w:t>Aunque el proyecto se desarrollo de forma individual, se aplico el flujo de trabajo colaborativo basado en ramas de funcionalidad (feature branches) y Pull Requests, tal como se haria en un equipo. Cada cambio significativo se desarrollo en su propia rama, se abrio un Pull Request describiendo el cambio, y se integro a la rama principal tras su revision.</w:t>
+        <w:t>Se aplico el flujo de trabajo colaborativo basado en ramas de funcionalidad (feature branches) y Pull Requests. Cada cambio significativo se desarrollo en su propia rama, se abrio un Pull Request describiendo el cambio, y se integro a la rama principal tras su revision. Este esquema permite que varios integrantes trabajen en paralelo sin sobrescribir el trabajo de los demas y deja registrado el motivo de cada modificacion.</w:t>
       </w:r>
     </w:p>
     <w:p>

</xml_diff>